<commit_message>
Sync §1 with Paper 2 Zenodo DOI 10.5281/zenodo.20013491 + ORCID 0009-0000-4724-2427
</commit_message>
<xml_diff>
--- a/manuscript/paper2_capacity_scaling.docx
+++ b/manuscript/paper2_capacity_scaling.docx
@@ -2357,6 +2357,20 @@
       <w:r>
         <w:rPr>
           <w:b/>
+        </w:rPr>
+        <w:t>ORCID:</w:t>
+      </w:r>
+      <w:r>
+        <w:t xml:space="preserve"> 0009-0000-4724-2427</w:t>
+      </w:r>
+    </w:p>
+    <w:p>
+      <w:pPr>
+        <w:pStyle w:val="Brdtekst"/>
+      </w:pPr>
+      <w:r>
+        <w:rPr>
+          <w:b/>
           <w:bCs/>
         </w:rPr>
         <w:t>Affiliation:</w:t>
@@ -2448,7 +2462,7 @@
         </w:r>
       </w:hyperlink>
       <w:r>
-        <w:t xml:space="preserve"> under CC BY 4.0.</w:t>
+        <w:t xml:space="preserve"> under CC BY 4.0. Zenodo deposit: DOI 10.5281/zenodo.20013491.</w:t>
       </w:r>
     </w:p>
     <w:p>

</xml_diff>